<commit_message>
Expand slide deck with full theory content per K/A sub-topic
Add a divider, "What is X?" concept slide (tile grid or numbered flow)
and a sourced supporting data visual (bar chart or takeaways grid) for
each of the 17 Knowledge/Ability sub-topics before its matching
in-class activity, instead of jumping straight from a bare concepts
list into activities. Deck grows from 142 to 189 slides; Lesson Plan
slide citations rebuilt to match.

Co-Authored-By: Claude Sonnet 5 <noreply@anthropic.com>
</commit_message>
<xml_diff>
--- a/courseware/LP-Customer-Centric Branding and Communication Tactics.docx
+++ b/courseware/LP-Customer-Centric Branding and Communication Tactics.docx
@@ -1045,7 +1045,7 @@
                 <w:b w:val="0"/>
                 <w:sz w:val="19"/>
               </w:rPr>
-              <w:t>Slides 15–24</w:t>
+              <w:t>Slides 15–29</w:t>
             </w:r>
           </w:p>
         </w:tc>
@@ -1187,7 +1187,7 @@
                 <w:b w:val="0"/>
                 <w:sz w:val="19"/>
               </w:rPr>
-              <w:t>Slides 31–37</w:t>
+              <w:t>Slides 39–48</w:t>
             </w:r>
           </w:p>
         </w:tc>
@@ -1333,7 +1333,7 @@
                 <w:b w:val="0"/>
                 <w:sz w:val="19"/>
               </w:rPr>
-              <w:t>Slides 45–54</w:t>
+              <w:t>Slides 56–70</w:t>
             </w:r>
           </w:p>
         </w:tc>
@@ -1475,7 +1475,7 @@
                 <w:b w:val="0"/>
                 <w:sz w:val="19"/>
               </w:rPr>
-              <w:t>Slides 60–66</w:t>
+              <w:t>Slides 79–88</w:t>
             </w:r>
           </w:p>
         </w:tc>
@@ -1548,7 +1548,7 @@
                 <w:b w:val="0"/>
                 <w:sz w:val="19"/>
               </w:rPr>
-              <w:t>Slides 73–83</w:t>
+              <w:t>Slides 95–110</w:t>
             </w:r>
           </w:p>
         </w:tc>
@@ -1869,7 +1869,7 @@
                 <w:b w:val="0"/>
                 <w:sz w:val="19"/>
               </w:rPr>
-              <w:t>Slides 89–96</w:t>
+              <w:t>Slides 119–129</w:t>
             </w:r>
           </w:p>
         </w:tc>
@@ -2015,7 +2015,7 @@
                 <w:b w:val="0"/>
                 <w:sz w:val="19"/>
               </w:rPr>
-              <w:t>Slides 103–112</w:t>
+              <w:t>Slides 136–150</w:t>
             </w:r>
           </w:p>
         </w:tc>
@@ -2157,7 +2157,7 @@
                 <w:b w:val="0"/>
                 <w:sz w:val="19"/>
               </w:rPr>
-              <w:t>Slides 118–125</w:t>
+              <w:t>Slides 159–169</w:t>
             </w:r>
           </w:p>
         </w:tc>
@@ -2299,7 +2299,7 @@
                 <w:b w:val="0"/>
                 <w:sz w:val="19"/>
               </w:rPr>
-              <w:t>Slide 130</w:t>
+              <w:t>Slide 177</w:t>
             </w:r>
           </w:p>
         </w:tc>
@@ -2518,7 +2518,7 @@
                 <w:b w:val="0"/>
                 <w:sz w:val="19"/>
               </w:rPr>
-              <w:t>Slide 138</w:t>
+              <w:t>Slide 185</w:t>
             </w:r>
           </w:p>
         </w:tc>
@@ -2610,7 +2610,7 @@
         <w:pStyle w:val="Heading3"/>
       </w:pPr>
       <w:r>
-        <w:t>Activity 1 — Stakeholder Influence Mapping · Slide 18</w:t>
+        <w:t>Activity 1 — Stakeholder Influence Mapping · Slide 20</w:t>
       </w:r>
     </w:p>
     <w:p>
@@ -2633,7 +2633,7 @@
         <w:pStyle w:val="Heading3"/>
       </w:pPr>
       <w:r>
-        <w:t>Activity 2 — Audience Mapping Workshop · Slide 24</w:t>
+        <w:t>Activity 2 — Audience Mapping Workshop · Slide 29</w:t>
       </w:r>
     </w:p>
     <w:p>
@@ -2656,7 +2656,7 @@
         <w:pStyle w:val="Heading3"/>
       </w:pPr>
       <w:r>
-        <w:t>Activity 3 — Brand Attribute Mapping · Slide 31</w:t>
+        <w:t>Activity 3 — Brand Attribute Mapping · Slide 39</w:t>
       </w:r>
     </w:p>
     <w:p>
@@ -2679,7 +2679,7 @@
         <w:pStyle w:val="Heading3"/>
       </w:pPr>
       <w:r>
-        <w:t>Activity 4 — Digital Reputation Audit Exercise · Slide 37</w:t>
+        <w:t>Activity 4 — Digital Reputation Audit Exercise · Slide 48</w:t>
       </w:r>
     </w:p>
     <w:p>
@@ -2702,7 +2702,7 @@
         <w:pStyle w:val="Heading2"/>
       </w:pPr>
       <w:r>
-        <w:t>LU2 — Customer Influence · Slide 45</w:t>
+        <w:t>LU2 — Customer Influence · Slide 56</w:t>
       </w:r>
     </w:p>
     <w:p>
@@ -2755,7 +2755,7 @@
         <w:pStyle w:val="Heading3"/>
       </w:pPr>
       <w:r>
-        <w:t>Activity 5 — Brand Perception Audit · Slide 48</w:t>
+        <w:t>Activity 5 — Brand Perception Audit · Slide 61</w:t>
       </w:r>
     </w:p>
     <w:p>
@@ -2778,7 +2778,7 @@
         <w:pStyle w:val="Heading3"/>
       </w:pPr>
       <w:r>
-        <w:t>Activity 6 — Brand Advocacy Assessment · Slide 54</w:t>
+        <w:t>Activity 6 — Brand Advocacy Assessment · Slide 70</w:t>
       </w:r>
     </w:p>
     <w:p>
@@ -2801,7 +2801,7 @@
         <w:pStyle w:val="Heading3"/>
       </w:pPr>
       <w:r>
-        <w:t>Activity 7 — Campaign Documentation Audit · Slide 60</w:t>
+        <w:t>Activity 7 — Campaign Documentation Audit · Slide 79</w:t>
       </w:r>
     </w:p>
     <w:p>
@@ -2824,7 +2824,7 @@
         <w:pStyle w:val="Heading3"/>
       </w:pPr>
       <w:r>
-        <w:t>Activity 8 — Customer Perspective Analysis · Slide 66</w:t>
+        <w:t>Activity 8 — Customer Perspective Analysis · Slide 88</w:t>
       </w:r>
     </w:p>
     <w:p>
@@ -2847,7 +2847,7 @@
         <w:pStyle w:val="Heading2"/>
       </w:pPr>
       <w:r>
-        <w:t>LU3 — Branding in Marketing · Slide 73</w:t>
+        <w:t>LU3 — Branding in Marketing · Slide 95</w:t>
       </w:r>
     </w:p>
     <w:p>
@@ -2900,7 +2900,7 @@
         <w:pStyle w:val="Heading3"/>
       </w:pPr>
       <w:r>
-        <w:t>Activity 9 — Brand Audit Workshop · Slide 76</w:t>
+        <w:t>Activity 9 — Brand Audit Workshop · Slide 100</w:t>
       </w:r>
     </w:p>
     <w:p>
@@ -2923,7 +2923,7 @@
         <w:pStyle w:val="Heading3"/>
       </w:pPr>
       <w:r>
-        <w:t>Activity 10 — Brand-Marketing Audit Exercise · Slide 83</w:t>
+        <w:t>Activity 10 — Brand-Marketing Audit Exercise · Slide 110</w:t>
       </w:r>
     </w:p>
     <w:p>
@@ -2946,7 +2946,7 @@
         <w:pStyle w:val="Heading3"/>
       </w:pPr>
       <w:r>
-        <w:t>Activity 11 — Brand Activation Planning Workshop · Slide 89</w:t>
+        <w:t>Activity 11 — Brand Activation Planning Workshop · Slide 119</w:t>
       </w:r>
     </w:p>
     <w:p>
@@ -2969,7 +2969,7 @@
         <w:pStyle w:val="Heading3"/>
       </w:pPr>
       <w:r>
-        <w:t>Activity 12 — PR Campaign Budget Planning · Slide 96</w:t>
+        <w:t>Activity 12 — PR Campaign Budget Planning · Slide 129</w:t>
       </w:r>
     </w:p>
     <w:p>
@@ -2992,7 +2992,7 @@
         <w:pStyle w:val="Heading2"/>
       </w:pPr>
       <w:r>
-        <w:t>LU4 — Branding Effectiveness · Slide 103</w:t>
+        <w:t>LU4 — Branding Effectiveness · Slide 136</w:t>
       </w:r>
     </w:p>
     <w:p>
@@ -3045,7 +3045,7 @@
         <w:pStyle w:val="Heading3"/>
       </w:pPr>
       <w:r>
-        <w:t>Activity 13 — Platform Reputation Audit · Slide 106</w:t>
+        <w:t>Activity 13 — Platform Reputation Audit · Slide 141</w:t>
       </w:r>
     </w:p>
     <w:p>
@@ -3068,7 +3068,7 @@
         <w:pStyle w:val="Heading3"/>
       </w:pPr>
       <w:r>
-        <w:t>Activity 14 — Brand Health Assessment · Slide 112</w:t>
+        <w:t>Activity 14 — Brand Health Assessment · Slide 150</w:t>
       </w:r>
     </w:p>
     <w:p>
@@ -3091,7 +3091,7 @@
         <w:pStyle w:val="Heading3"/>
       </w:pPr>
       <w:r>
-        <w:t>Activity 15 — PR Crisis Response Plan · Slide 118</w:t>
+        <w:t>Activity 15 — PR Crisis Response Plan · Slide 159</w:t>
       </w:r>
     </w:p>
     <w:p>
@@ -3114,7 +3114,7 @@
         <w:pStyle w:val="Heading3"/>
       </w:pPr>
       <w:r>
-        <w:t>Activity 16 — KPI Dashboard Design · Slide 125</w:t>
+        <w:t>Activity 16 — KPI Dashboard Design · Slide 169</w:t>
       </w:r>
     </w:p>
     <w:p>
@@ -3137,7 +3137,7 @@
         <w:pStyle w:val="Heading3"/>
       </w:pPr>
       <w:r>
-        <w:t>Activity 17 — PR Campaign Audit Exercise · Slide 130</w:t>
+        <w:t>Activity 17 — PR Campaign Audit Exercise · Slide 177</w:t>
       </w:r>
     </w:p>
     <w:p>

</xml_diff>

<commit_message>
course materials rendered v2
</commit_message>
<xml_diff>
--- a/courseware/LP-Customer-Centric Branding and Communication Tactics.docx
+++ b/courseware/LP-Customer-Centric Branding and Communication Tactics.docx
@@ -1045,7 +1045,7 @@
                 <w:b w:val="0"/>
                 <w:sz w:val="19"/>
               </w:rPr>
-              <w:t>Slides 15–35</w:t>
+              <w:t>Slides 16–40</w:t>
             </w:r>
           </w:p>
         </w:tc>
@@ -1187,7 +1187,7 @@
                 <w:b w:val="0"/>
                 <w:sz w:val="19"/>
               </w:rPr>
-              <w:t>Slides 48–60</w:t>
+              <w:t>Slides 55–69</w:t>
             </w:r>
           </w:p>
         </w:tc>
@@ -1333,7 +1333,7 @@
                 <w:b w:val="0"/>
                 <w:sz w:val="19"/>
               </w:rPr>
-              <w:t>Slides 68–88</w:t>
+              <w:t>Slides 77–101</w:t>
             </w:r>
           </w:p>
         </w:tc>
@@ -1475,7 +1475,7 @@
                 <w:b w:val="0"/>
                 <w:sz w:val="19"/>
               </w:rPr>
-              <w:t>Slides 100–112</w:t>
+              <w:t>Slides 115–129</w:t>
             </w:r>
           </w:p>
         </w:tc>
@@ -1548,7 +1548,7 @@
                 <w:b w:val="0"/>
                 <w:sz w:val="19"/>
               </w:rPr>
-              <w:t>Slides 119–140</w:t>
+              <w:t>Slides 136–161</w:t>
             </w:r>
           </w:p>
         </w:tc>
@@ -1869,7 +1869,7 @@
                 <w:b w:val="0"/>
                 <w:sz w:val="19"/>
               </w:rPr>
-              <w:t>Slides 152–165</w:t>
+              <w:t>Slides 175–190</w:t>
             </w:r>
           </w:p>
         </w:tc>
@@ -2015,7 +2015,7 @@
                 <w:b w:val="0"/>
                 <w:sz w:val="19"/>
               </w:rPr>
-              <w:t>Slides 172–192</w:t>
+              <w:t>Slides 197–221</w:t>
             </w:r>
           </w:p>
         </w:tc>
@@ -2157,7 +2157,7 @@
                 <w:b w:val="0"/>
                 <w:sz w:val="19"/>
               </w:rPr>
-              <w:t>Slides 204–217</w:t>
+              <w:t>Slides 235–250</w:t>
             </w:r>
           </w:p>
         </w:tc>
@@ -2299,7 +2299,7 @@
                 <w:b w:val="0"/>
                 <w:sz w:val="19"/>
               </w:rPr>
-              <w:t>Slide 228</w:t>
+              <w:t>Slide 263</w:t>
             </w:r>
           </w:p>
         </w:tc>
@@ -2372,7 +2372,7 @@
                 <w:b w:val="0"/>
                 <w:sz w:val="19"/>
               </w:rPr>
-              <w:t>Slide 11</w:t>
+              <w:t>Slide 12</w:t>
             </w:r>
           </w:p>
         </w:tc>
@@ -2445,7 +2445,7 @@
                 <w:b w:val="0"/>
                 <w:sz w:val="19"/>
               </w:rPr>
-              <w:t>Slide 12</w:t>
+              <w:t>Slide 13</w:t>
             </w:r>
           </w:p>
         </w:tc>
@@ -2518,7 +2518,7 @@
                 <w:b w:val="0"/>
                 <w:sz w:val="19"/>
               </w:rPr>
-              <w:t>Slide 236</w:t>
+              <w:t>Slide 271</w:t>
             </w:r>
           </w:p>
         </w:tc>
@@ -2557,7 +2557,7 @@
         <w:pStyle w:val="Heading2"/>
       </w:pPr>
       <w:r>
-        <w:t>LU1 — Stakeholders and Organisation · Slide 15</w:t>
+        <w:t>LU1 — Stakeholders and Organisation · Slide 16</w:t>
       </w:r>
     </w:p>
     <w:p>
@@ -2610,7 +2610,7 @@
         <w:pStyle w:val="Heading3"/>
       </w:pPr>
       <w:r>
-        <w:t>Activity 1 — Stakeholder Influence Mapping · Slide 23</w:t>
+        <w:t>Activity 1 — Stakeholder Influence Mapping · Slide 26</w:t>
       </w:r>
     </w:p>
     <w:p>
@@ -2633,7 +2633,7 @@
         <w:pStyle w:val="Heading3"/>
       </w:pPr>
       <w:r>
-        <w:t>Activity 2 — Audience Mapping Workshop · Slide 35</w:t>
+        <w:t>Activity 2 — Audience Mapping Workshop · Slide 40</w:t>
       </w:r>
     </w:p>
     <w:p>
@@ -2656,7 +2656,7 @@
         <w:pStyle w:val="Heading3"/>
       </w:pPr>
       <w:r>
-        <w:t>Activity 3 — Brand Attribute Mapping · Slide 48</w:t>
+        <w:t>Activity 3 — Brand Attribute Mapping · Slide 55</w:t>
       </w:r>
     </w:p>
     <w:p>
@@ -2679,7 +2679,7 @@
         <w:pStyle w:val="Heading3"/>
       </w:pPr>
       <w:r>
-        <w:t>Activity 4 — Digital Reputation Audit Exercise · Slide 60</w:t>
+        <w:t>Activity 4 — Digital Reputation Audit Exercise · Slide 69</w:t>
       </w:r>
     </w:p>
     <w:p>
@@ -2702,7 +2702,7 @@
         <w:pStyle w:val="Heading2"/>
       </w:pPr>
       <w:r>
-        <w:t>LU2 — Customer Influence · Slide 68</w:t>
+        <w:t>LU2 — Customer Influence · Slide 77</w:t>
       </w:r>
     </w:p>
     <w:p>
@@ -2755,7 +2755,7 @@
         <w:pStyle w:val="Heading3"/>
       </w:pPr>
       <w:r>
-        <w:t>Activity 5 — Brand Perception Audit · Slide 76</w:t>
+        <w:t>Activity 5 — Brand Perception Audit · Slide 87</w:t>
       </w:r>
     </w:p>
     <w:p>
@@ -2778,7 +2778,7 @@
         <w:pStyle w:val="Heading3"/>
       </w:pPr>
       <w:r>
-        <w:t>Activity 6 — Brand Advocacy Assessment · Slide 88</w:t>
+        <w:t>Activity 6 — Brand Advocacy Assessment · Slide 101</w:t>
       </w:r>
     </w:p>
     <w:p>
@@ -2801,7 +2801,7 @@
         <w:pStyle w:val="Heading3"/>
       </w:pPr>
       <w:r>
-        <w:t>Activity 7 — Campaign Documentation Audit · Slide 100</w:t>
+        <w:t>Activity 7 — Campaign Documentation Audit · Slide 115</w:t>
       </w:r>
     </w:p>
     <w:p>
@@ -2824,7 +2824,7 @@
         <w:pStyle w:val="Heading3"/>
       </w:pPr>
       <w:r>
-        <w:t>Activity 8 — Customer Perspective Analysis · Slide 112</w:t>
+        <w:t>Activity 8 — Customer Perspective Analysis · Slide 129</w:t>
       </w:r>
     </w:p>
     <w:p>
@@ -2847,7 +2847,7 @@
         <w:pStyle w:val="Heading2"/>
       </w:pPr>
       <w:r>
-        <w:t>LU3 — Branding in Marketing · Slide 119</w:t>
+        <w:t>LU3 — Branding in Marketing · Slide 136</w:t>
       </w:r>
     </w:p>
     <w:p>
@@ -2900,7 +2900,7 @@
         <w:pStyle w:val="Heading3"/>
       </w:pPr>
       <w:r>
-        <w:t>Activity 9 — Brand Audit Workshop · Slide 127</w:t>
+        <w:t>Activity 9 — Brand Audit Workshop · Slide 146</w:t>
       </w:r>
     </w:p>
     <w:p>
@@ -2923,7 +2923,7 @@
         <w:pStyle w:val="Heading3"/>
       </w:pPr>
       <w:r>
-        <w:t>Activity 10 — Brand-Marketing Audit Exercise · Slide 140</w:t>
+        <w:t>Activity 10 — Brand-Marketing Audit Exercise · Slide 161</w:t>
       </w:r>
     </w:p>
     <w:p>
@@ -2946,7 +2946,7 @@
         <w:pStyle w:val="Heading3"/>
       </w:pPr>
       <w:r>
-        <w:t>Activity 11 — Brand Activation Planning Workshop · Slide 152</w:t>
+        <w:t>Activity 11 — Brand Activation Planning Workshop · Slide 175</w:t>
       </w:r>
     </w:p>
     <w:p>
@@ -2969,7 +2969,7 @@
         <w:pStyle w:val="Heading3"/>
       </w:pPr>
       <w:r>
-        <w:t>Activity 12 — PR Campaign Budget Planning · Slide 165</w:t>
+        <w:t>Activity 12 — PR Campaign Budget Planning · Slide 190</w:t>
       </w:r>
     </w:p>
     <w:p>
@@ -2992,7 +2992,7 @@
         <w:pStyle w:val="Heading2"/>
       </w:pPr>
       <w:r>
-        <w:t>LU4 — Branding Effectiveness · Slide 172</w:t>
+        <w:t>LU4 — Branding Effectiveness · Slide 197</w:t>
       </w:r>
     </w:p>
     <w:p>
@@ -3045,7 +3045,7 @@
         <w:pStyle w:val="Heading3"/>
       </w:pPr>
       <w:r>
-        <w:t>Activity 13 — Platform Reputation Audit · Slide 180</w:t>
+        <w:t>Activity 13 — Platform Reputation Audit · Slide 207</w:t>
       </w:r>
     </w:p>
     <w:p>
@@ -3068,7 +3068,7 @@
         <w:pStyle w:val="Heading3"/>
       </w:pPr>
       <w:r>
-        <w:t>Activity 14 — Brand Health Assessment · Slide 192</w:t>
+        <w:t>Activity 14 — Brand Health Assessment · Slide 221</w:t>
       </w:r>
     </w:p>
     <w:p>
@@ -3091,7 +3091,7 @@
         <w:pStyle w:val="Heading3"/>
       </w:pPr>
       <w:r>
-        <w:t>Activity 15 — PR Crisis Response Plan · Slide 204</w:t>
+        <w:t>Activity 15 — PR Crisis Response Plan · Slide 235</w:t>
       </w:r>
     </w:p>
     <w:p>
@@ -3114,7 +3114,7 @@
         <w:pStyle w:val="Heading3"/>
       </w:pPr>
       <w:r>
-        <w:t>Activity 16 — KPI Dashboard Design · Slide 217</w:t>
+        <w:t>Activity 16 — KPI Dashboard Design · Slide 250</w:t>
       </w:r>
     </w:p>
     <w:p>
@@ -3137,7 +3137,7 @@
         <w:pStyle w:val="Heading3"/>
       </w:pPr>
       <w:r>
-        <w:t>Activity 17 — PR Campaign Audit Exercise · Slide 228</w:t>
+        <w:t>Activity 17 — PR Campaign Audit Exercise · Slide 263</w:t>
       </w:r>
     </w:p>
     <w:p>

</xml_diff>